<commit_message>
ToDo-Docx: Services-Texte final eintragen und an Live-Website angleichen
Tippfehler (voranbring./Mexico) korrigiert und fehlenden Passus zu
langjaehriger Erfahrung/KI-Nutzung ergaenzt, damit der Text 1:1 dem
bereits live auf services.html stehenden Inhalt entspricht.
</commit_message>
<xml_diff>
--- a/docs/Pro4Ex-Website-ToDo-Content-Bilder.docx
+++ b/docs/Pro4Ex-Website-ToDo-Content-Bilder.docx
@@ -91,28 +91,7 @@
           <w:b/>
           <w:lang w:val="de-DE"/>
         </w:rPr>
-        <w:t xml:space="preserve">Beispiel 1 – </w:t>
-      </w:r>
-      <w:r>
-        <w:rPr>
-          <w:b/>
-          <w:lang w:val="de-DE"/>
-        </w:rPr>
-        <w:t>K</w:t>
-      </w:r>
-      <w:r>
-        <w:rPr>
-          <w:b/>
-          <w:lang w:val="de-DE"/>
-        </w:rPr>
-        <w:t xml:space="preserve">omplexe Verhandlungen </w:t>
-      </w:r>
-      <w:r>
-        <w:rPr>
-          <w:b/>
-          <w:lang w:val="de-DE"/>
-        </w:rPr>
-        <w:t>(Volumenclaims oder Regressfälle)</w:t>
+        <w:t>Beispiel 1 – Komplexe Verhandlungen (Volumenclaims oder Regressfälle)</w:t>
       </w:r>
     </w:p>
     <w:p>
@@ -129,15 +108,7 @@
           <w:color w:val="6B7280"/>
           <w:lang w:val="de-DE"/>
         </w:rPr>
-        <w:t xml:space="preserve">Ich coache, begleite und verhandle komplexe Fälle wie Volumenclaims oder Regressfälle – immer auf Augenhöhe mit strategischem Scharfsinn. Meine Stärke: Interessenskonflikte faktisch belastbar quantifizieren und nachhaltige Lösungen erschließen. </w:t>
-      </w:r>
-      <w:r>
-        <w:rPr>
-          <w:i/>
-          <w:color w:val="6B7280"/>
-          <w:lang w:val="de-DE"/>
-        </w:rPr>
-        <w:t>Mein Ergebnis: tragfähige Vereinbarungen, die Ihre Position sichern.</w:t>
+        <w:t>Ich coache, begleite und verhandle komplexe Fälle wie Volumenclaims oder Regressfälle – immer auf Augenhöhe mit strategischem Scharfsinn. Meine Stärke: Interessenskonflikte faktisch belastbar quantifizieren und nachhaltige Lösungen erschließen. Mein Ergebnis: tragfähige Vereinbarungen, die Ihre Position sichern.</w:t>
       </w:r>
     </w:p>
     <w:p>
@@ -165,14 +136,7 @@
           <w:b/>
           <w:lang w:val="de-DE"/>
         </w:rPr>
-        <w:t xml:space="preserve">Beispiel 2 – </w:t>
-      </w:r>
-      <w:r>
-        <w:rPr>
-          <w:b/>
-          <w:lang w:val="de-DE"/>
-        </w:rPr>
-        <w:t>Vertriebsstrategien</w:t>
+        <w:t>Beispiel 2 – Vertriebsstrategien</w:t>
       </w:r>
     </w:p>
     <w:p>
@@ -217,42 +181,7 @@
           <w:b/>
           <w:lang w:val="de-DE"/>
         </w:rPr>
-        <w:t xml:space="preserve">Beispiel 3 – </w:t>
-      </w:r>
-      <w:r>
-        <w:rPr>
-          <w:b/>
-          <w:lang w:val="de-DE"/>
-        </w:rPr>
-        <w:t>Interkulturelle Projekte (</w:t>
-      </w:r>
-      <w:r>
-        <w:rPr>
-          <w:b/>
-          <w:lang w:val="de-DE"/>
-        </w:rPr>
-        <w:t>Industrialisierung</w:t>
-      </w:r>
-      <w:r>
-        <w:rPr>
-          <w:b/>
-          <w:lang w:val="de-DE"/>
-        </w:rPr>
-        <w:t xml:space="preserve"> oder </w:t>
-      </w:r>
-      <w:r>
-        <w:rPr>
-          <w:b/>
-          <w:lang w:val="de-DE"/>
-        </w:rPr>
-        <w:t>Eintritt in den Europäischen Automotive Markt)</w:t>
-      </w:r>
-      <w:r>
-        <w:rPr>
-          <w:b/>
-          <w:lang w:val="de-DE"/>
-        </w:rPr>
-        <w:t xml:space="preserve"> </w:t>
+        <w:t xml:space="preserve">Beispiel 3 – Interkulturelle Projekte (Industrialisierung oder Eintritt in den Europäischen Automotive Markt) </w:t>
       </w:r>
     </w:p>
     <w:p>
@@ -267,89 +196,43 @@
           <w:color w:val="6B7280"/>
           <w:lang w:val="de-DE"/>
         </w:rPr>
-        <w:t xml:space="preserve">Ich begleite Markteintrittsstrategien und Industrialisierungsprojekte mit Kulturkompetenz und langjähriger Praxis. Ich übersetze strategische Ziele in operative Realitäten – mit fundiertem Verständnis für Märkte, Partner und Prozesse. </w:t>
+        <w:t>Ich begleite Markteintrittsstrategien und Industrialisierungsprojekte mit Kulturkompetenz und langjähriger Praxis. Ich übersetze strategische Ziele in operative Realitäten – mit fundiertem Verständnis für Märkte, Partner und Prozesse. Mein Mehrwert: risikominimierte Schritte und schlanke, handlungsfähige Umsetzung..</w:t>
       </w:r>
+    </w:p>
+    <w:p>
+      <w:pPr>
+        <w:rPr>
+          <w:lang w:val="de-DE"/>
+        </w:rPr>
+      </w:pPr>
+    </w:p>
+    <w:p>
+      <w:pPr>
+        <w:rPr>
+          <w:lang w:val="de-DE"/>
+        </w:rPr>
+      </w:pPr>
+      <w:r>
+        <w:rPr>
+          <w:b/>
+          <w:lang w:val="de-DE"/>
+        </w:rPr>
+        <w:t>Beispiel 4 – Strategic Consulting (generelle Automotive Strategien oder auch Vertriebsstrategien)</w:t>
+      </w:r>
+    </w:p>
+    <w:p>
+      <w:pPr>
+        <w:rPr>
+          <w:lang w:val="de-DE"/>
+        </w:rPr>
+      </w:pPr>
       <w:r>
         <w:rPr>
           <w:i/>
           <w:color w:val="6B7280"/>
           <w:lang w:val="de-DE"/>
         </w:rPr>
-        <w:t>Mein Mehrwert: risikominimierte Schritte und schlanke, handlungsfähige Umsetzung.</w:t>
-      </w:r>
-      <w:r>
-        <w:rPr>
-          <w:i/>
-          <w:color w:val="6B7280"/>
-          <w:lang w:val="de-DE"/>
-        </w:rPr>
-        <w:t>.</w:t>
-      </w:r>
-    </w:p>
-    <w:p>
-      <w:pPr>
-        <w:rPr>
-          <w:lang w:val="de-DE"/>
-        </w:rPr>
-      </w:pPr>
-    </w:p>
-    <w:p>
-      <w:pPr>
-        <w:rPr>
-          <w:lang w:val="de-DE"/>
-        </w:rPr>
-      </w:pPr>
-      <w:r>
-        <w:rPr>
-          <w:b/>
-          <w:lang w:val="de-DE"/>
-        </w:rPr>
-        <w:t>Beispiel 4 – Strategic Consulting</w:t>
-      </w:r>
-      <w:r>
-        <w:rPr>
-          <w:b/>
-          <w:lang w:val="de-DE"/>
-        </w:rPr>
-        <w:t xml:space="preserve"> (generelle Automotive Strategien oder auch </w:t>
-      </w:r>
-      <w:r>
-        <w:rPr>
-          <w:b/>
-          <w:lang w:val="de-DE"/>
-        </w:rPr>
-        <w:t>Vertriebsstrategien)</w:t>
-      </w:r>
-    </w:p>
-    <w:p>
-      <w:pPr>
-        <w:rPr>
-          <w:lang w:val="de-DE"/>
-        </w:rPr>
-      </w:pPr>
-      <w:r>
-        <w:rPr>
-          <w:i/>
-          <w:color w:val="6B7280"/>
-          <w:lang w:val="de-DE"/>
-        </w:rPr>
-        <w:t>Von Geschäftsmodellen über Vertriebssetups bis Wertschöpfungsketten – ich berate zu zukunftssicheren Strategien. Datengetriebene Analyse verbindet sich mit operativer Expertise</w:t>
-      </w:r>
-      <w:r>
-        <w:rPr>
-          <w:i/>
-          <w:color w:val="6B7280"/>
-          <w:lang w:val="de-DE"/>
-        </w:rPr>
-        <w:t xml:space="preserve"> und Erfahrung</w:t>
-      </w:r>
-      <w:r>
-        <w:rPr>
-          <w:i/>
-          <w:color w:val="6B7280"/>
-          <w:lang w:val="de-DE"/>
-        </w:rPr>
-        <w:t>. Mein Resultat: klare Handlungsprogramme für Vorstand und Management.</w:t>
+        <w:t>Von Geschäftsmodellen über Vertriebssetups bis Wertschöpfungsketten – ich berate zu zukunftssicheren Strategien. Datengetriebene Analyse verbindet sich mit operativer Expertise und Erfahrung. Mein Resultat: klare Handlungsprogramme für Vorstand und Management.</w:t>
       </w:r>
     </w:p>
     <w:p>
@@ -368,60 +251,111 @@
     </w:p>
     <w:p>
       <w:pPr>
+        <w:pStyle w:val="font-claude-response-body"/>
         <w:rPr>
           <w:lang w:val="de-DE"/>
         </w:rPr>
       </w:pPr>
       <w:r>
         <w:rPr>
-          <w:b/>
           <w:lang w:val="de-DE"/>
         </w:rPr>
-        <w:t>Intro-Text (ca. 150 Wörter)</w:t>
+        <w:t>Die Automotive-Industrie ist unter Druck: Elektrifizierung, neue Konkurrenz, globale Lieferketten und ständig steigende Komplexität. Wer heute erfolgreich sein will, braucht Partner, die nicht nur Probleme analysieren, sondern diese auch lösen. Ich begleite Automotive-Unternehmen in kritischen Bereichen.</w:t>
       </w:r>
     </w:p>
     <w:p>
       <w:pPr>
+        <w:pStyle w:val="font-claude-response-body"/>
         <w:rPr>
           <w:lang w:val="de-DE"/>
         </w:rPr>
       </w:pPr>
       <w:r>
         <w:rPr>
-          <w:i/>
           <w:lang w:val="de-DE"/>
         </w:rPr>
-        <w:t>„Spezialisiert auf Supply Chain Management" – kurze Einleitung für die Seite.</w:t>
+        <w:t xml:space="preserve">Ob in </w:t>
+      </w:r>
+      <w:r>
+        <w:rPr>
+          <w:rStyle w:val="Fett"/>
+          <w:lang w:val="de-DE"/>
+        </w:rPr>
+        <w:t>Verhandlungen</w:t>
+      </w:r>
+      <w:r>
+        <w:rPr>
+          <w:lang w:val="de-DE"/>
+        </w:rPr>
+        <w:t xml:space="preserve"> über Volumenclaims und Regressfälle, in der </w:t>
+      </w:r>
+      <w:r>
+        <w:rPr>
+          <w:rStyle w:val="Fett"/>
+          <w:lang w:val="de-DE"/>
+        </w:rPr>
+        <w:t>Optimierung von Vertriebsstrategien</w:t>
+      </w:r>
+      <w:r>
+        <w:rPr>
+          <w:lang w:val="de-DE"/>
+        </w:rPr>
+        <w:t xml:space="preserve"> für profitables Wachstum, bei </w:t>
+      </w:r>
+      <w:r>
+        <w:rPr>
+          <w:rStyle w:val="Fett"/>
+          <w:lang w:val="de-DE"/>
+        </w:rPr>
+        <w:t>internationalen Markteintritten</w:t>
+      </w:r>
+      <w:r>
+        <w:rPr>
+          <w:lang w:val="de-DE"/>
+        </w:rPr>
+        <w:t xml:space="preserve"> mit kulturellem Scharfsinn oder in der </w:t>
+      </w:r>
+      <w:r>
+        <w:rPr>
+          <w:rStyle w:val="Fett"/>
+          <w:lang w:val="de-DE"/>
+        </w:rPr>
+        <w:t>Neuausrichtung von Geschäftsmodellen</w:t>
+      </w:r>
+      <w:r>
+        <w:rPr>
+          <w:lang w:val="de-DE"/>
+        </w:rPr>
+        <w:t xml:space="preserve"> – ich bringe strategische Klarheit und operative Kraft mit.</w:t>
       </w:r>
     </w:p>
     <w:p>
       <w:pPr>
+        <w:pStyle w:val="font-claude-response-body"/>
         <w:rPr>
           <w:lang w:val="de-DE"/>
         </w:rPr>
       </w:pPr>
       <w:r>
         <w:rPr>
-          <w:i/>
-          <w:color w:val="6B7280"/>
           <w:lang w:val="de-DE"/>
         </w:rPr>
-        <w:t>[Hier eintragen]</w:t>
+        <w:t>Mein Ansatz ist datengetrieben, faktenbasiert und immer auf Umsetzung fokussiert. Keine Powerpoints, die in der Schublade landen. Keine Ratschläge ohne Haltung. Nur Ergebnisse, die zählen.</w:t>
       </w:r>
     </w:p>
     <w:p>
       <w:pPr>
+        <w:pStyle w:val="font-claude-response-body"/>
         <w:rPr>
           <w:lang w:val="de-DE"/>
         </w:rPr>
       </w:pPr>
-    </w:p>
-    <w:p>
-      <w:pPr>
+      <w:r>
         <w:rPr>
           <w:lang w:val="de-DE"/>
         </w:rPr>
-      </w:pPr>
+        <w:t>Die folgenden vier Leistungsfelder zeigen, wie ich Unternehmen voranbringe.</w:t>
+      </w:r>
     </w:p>
     <w:p>
       <w:pPr>
@@ -429,445 +363,246 @@
           <w:lang w:val="de-DE"/>
         </w:rPr>
       </w:pPr>
+    </w:p>
+    <w:p>
+      <w:pPr>
+        <w:pStyle w:val="berschrift3"/>
+        <w:rPr>
+          <w:rFonts w:ascii="Times New Roman" w:hAnsi="Times New Roman"/>
+          <w:lang w:val="de-DE"/>
+        </w:rPr>
+      </w:pPr>
       <w:r>
         <w:rPr>
+          <w:rStyle w:val="Fett"/>
           <w:b/>
+          <w:bCs/>
           <w:lang w:val="de-DE"/>
         </w:rPr>
-        <w:t>Leistung 1 – Supply Chain Optimization (ca. 250 Wörter)</w:t>
+        <w:t>Komplexe Verhandlungen</w:t>
       </w:r>
     </w:p>
     <w:p>
       <w:pPr>
-        <w:pStyle w:val="Aufzhlungszeichen"/>
+        <w:pStyle w:val="font-claude-response-body"/>
         <w:rPr>
           <w:lang w:val="de-DE"/>
         </w:rPr>
       </w:pPr>
       <w:r>
         <w:rPr>
-          <w:b/>
           <w:lang w:val="de-DE"/>
         </w:rPr>
-        <w:t xml:space="preserve">Was ist das? </w:t>
-      </w:r>
-      <w:r>
-        <w:rPr>
-          <w:i/>
-          <w:lang w:val="de-DE"/>
-        </w:rPr>
-        <w:t>[Hier eintragen]</w:t>
+        <w:t>Ich coache, begleite und verhandle komplexe Fälle wie Volumenclaims oder Regressfälle – immer auf Augenhöhe mit strategischem Scharfsinn. In der Automotive-Industrie entstehen regelmäßig Streitfälle, die existenzielle Bedeutung haben: strittige Mengenabweichungen bei Lieferanten, Regressansprüche nach Qualitätsmängeln oder Feldproblemen oder auch Preisanpassungsdebatten. Hier braucht es mehr als juristische Standardargumente.</w:t>
       </w:r>
     </w:p>
     <w:p>
       <w:pPr>
-        <w:pStyle w:val="Aufzhlungszeichen"/>
+        <w:pStyle w:val="font-claude-response-body"/>
         <w:rPr>
           <w:lang w:val="de-DE"/>
         </w:rPr>
       </w:pPr>
       <w:r>
         <w:rPr>
-          <w:b/>
           <w:lang w:val="de-DE"/>
         </w:rPr>
-        <w:t xml:space="preserve">Warum ist das wichtig? </w:t>
-      </w:r>
-      <w:r>
-        <w:rPr>
-          <w:i/>
-          <w:lang w:val="de-DE"/>
-        </w:rPr>
-        <w:t>[Hier eintragen]</w:t>
+        <w:t>Meine Stärke liegt darin, komplexe Interessenskonflikte faktisch belastbar zu quantifizieren. Ich analysiere Verträge, Datenreihen und Prozessdokumentation, um Positionen nicht auf Basis von Emotionen, sondern auf Basis von Fakten zu bewerten. Gemeinsam entwickeln wir Verhandlungsstrategien, die Ihre Interessen maximieren und gleichzeitig nachhaltige Lösungen erschließen.</w:t>
       </w:r>
     </w:p>
     <w:p>
       <w:pPr>
-        <w:pStyle w:val="Aufzhlungszeichen"/>
+        <w:pStyle w:val="font-claude-response-body"/>
         <w:rPr>
           <w:lang w:val="de-DE"/>
         </w:rPr>
       </w:pPr>
       <w:r>
         <w:rPr>
-          <w:b/>
           <w:lang w:val="de-DE"/>
         </w:rPr>
-        <w:t xml:space="preserve">Wie funktioniert es? </w:t>
-      </w:r>
-      <w:r>
-        <w:rPr>
-          <w:i/>
-          <w:lang w:val="de-DE"/>
-        </w:rPr>
-        <w:t>[Hier eintragen]</w:t>
+        <w:lastRenderedPageBreak/>
+        <w:t>Das Ergebnis: tragfähige Vereinbarungen, die Ihre Position sichern – ohne Bitterkeit zu hinterlassen. Diese Kombination aus strategischem Scharfsinn, faktischer Substanz und Verhandlungsgeschick führt zu Abschlüssen, die halten.</w:t>
       </w:r>
     </w:p>
     <w:p>
       <w:pPr>
-        <w:pStyle w:val="Aufzhlungszeichen"/>
+        <w:pStyle w:val="berschrift3"/>
         <w:rPr>
           <w:lang w:val="de-DE"/>
         </w:rPr>
       </w:pPr>
       <w:r>
         <w:rPr>
+          <w:rStyle w:val="Fett"/>
           <w:b/>
+          <w:bCs/>
           <w:lang w:val="de-DE"/>
         </w:rPr>
-        <w:t xml:space="preserve">Welche Ergebnisse gibt es? (mit Zahlen) </w:t>
-      </w:r>
-      <w:r>
-        <w:rPr>
-          <w:i/>
-          <w:lang w:val="de-DE"/>
-        </w:rPr>
-        <w:t>[Hier eintragen]</w:t>
+        <w:t>Vertriebsstrategien</w:t>
       </w:r>
     </w:p>
     <w:p>
       <w:pPr>
+        <w:pStyle w:val="font-claude-response-body"/>
         <w:rPr>
           <w:lang w:val="de-DE"/>
         </w:rPr>
       </w:pPr>
-    </w:p>
-    <w:p>
-      <w:pPr>
+      <w:r>
         <w:rPr>
           <w:lang w:val="de-DE"/>
         </w:rPr>
-      </w:pPr>
+        <w:t>Ich analysiere Vertriebsprozesse systematisch, identifiziere Marktpotentiale und optimiere Ihre Sales-Architektur. Im Automotive-Sektor ist Vertrieb keine Commodity – es geht um langfristige Partnerschaften, komplexe Ausschreibungsprozesse und oft um Verhandlungen auf mehreren Hierarchieebenen.</w:t>
+      </w:r>
     </w:p>
     <w:p>
       <w:pPr>
+        <w:pStyle w:val="font-claude-response-body"/>
         <w:rPr>
           <w:lang w:val="de-DE"/>
         </w:rPr>
       </w:pPr>
       <w:r>
         <w:rPr>
-          <w:b/>
           <w:lang w:val="de-DE"/>
         </w:rPr>
-        <w:t>Leistung 2 – Supplier Management (ca. 250 Wörter)</w:t>
+        <w:t>Gemeinsam schärfen wir Kanäle, heben Effizienzpotentiale und aktivieren verborgene Sales-Hebel. Das kann bedeuten: Kunden-Segmentierung überprüfen, Vertriebsteams neu strukturieren, Pricing-Logik transparenter gestalten oder auch digitale Vertriebstools besser nutzen. Ich arbeite mit Ihrem Team, nicht dagegen. Wir verstehen gemeinsam, wo echte Wachstumschancen liegen und wo nur kosmetische Maßnahmen geplant waren.</w:t>
       </w:r>
     </w:p>
     <w:p>
       <w:pPr>
-        <w:pStyle w:val="Aufzhlungszeichen"/>
+        <w:pStyle w:val="font-claude-response-body"/>
         <w:rPr>
           <w:lang w:val="de-DE"/>
         </w:rPr>
       </w:pPr>
       <w:r>
         <w:rPr>
-          <w:b/>
           <w:lang w:val="de-DE"/>
         </w:rPr>
-        <w:t xml:space="preserve">Was ist das? </w:t>
-      </w:r>
-      <w:r>
-        <w:rPr>
-          <w:i/>
-          <w:lang w:val="de-DE"/>
-        </w:rPr>
-        <w:t>[Hier eintragen]</w:t>
+        <w:t>Mein Fokus liegt auf messbarem Wachstum und schlanker Absatzorganisation – ohne Ballast im Automotive-Umfeld. Das bedeutet: keine aufgeblähten Prozesse, keine Papiertigerorganisationen. Stattdessen: klare Rollen, definierte Verkaufspfade, Kennzahlen, die wirklich zählen. Das Ergebnis ist eine Vertriebsorganisation, die schnell ist, fokussiert und nachweislich profitable Deals abschließt.</w:t>
       </w:r>
     </w:p>
     <w:p>
       <w:pPr>
-        <w:pStyle w:val="Aufzhlungszeichen"/>
+        <w:pStyle w:val="berschrift3"/>
         <w:rPr>
           <w:lang w:val="de-DE"/>
         </w:rPr>
       </w:pPr>
       <w:r>
         <w:rPr>
+          <w:rStyle w:val="Fett"/>
           <w:b/>
+          <w:bCs/>
           <w:lang w:val="de-DE"/>
         </w:rPr>
-        <w:t xml:space="preserve">Warum ist das wichtig? </w:t>
-      </w:r>
-      <w:r>
-        <w:rPr>
-          <w:i/>
-          <w:lang w:val="de-DE"/>
-        </w:rPr>
-        <w:t>[Hier eintragen]</w:t>
+        <w:t>Interkulturelle Projekte</w:t>
       </w:r>
     </w:p>
     <w:p>
       <w:pPr>
-        <w:pStyle w:val="Aufzhlungszeichen"/>
+        <w:pStyle w:val="font-claude-response-body"/>
         <w:rPr>
           <w:lang w:val="de-DE"/>
         </w:rPr>
       </w:pPr>
       <w:r>
         <w:rPr>
-          <w:b/>
           <w:lang w:val="de-DE"/>
         </w:rPr>
-        <w:t xml:space="preserve">Wie funktioniert es? </w:t>
-      </w:r>
-      <w:r>
-        <w:rPr>
-          <w:i/>
-          <w:lang w:val="de-DE"/>
-        </w:rPr>
-        <w:t>[Hier eintragen]</w:t>
+        <w:t>Ich begleite Markteintrittsstrategien und Industrialisierungsprojekte mit Kulturkompetenz und langjähriger Praxis. Der Automotive-Markt ist heterogen: regulatorische Anforderungen unterscheiden sich, Geschäftskulturen variieren, Partnerschaften folgen lokalen Spielregeln. Ein asiatisches Unternehmen, das in Europa produzieren will, braucht anderes Wissen als eines, das beispielsweise in Mexiko industrialisieren wird.</w:t>
       </w:r>
     </w:p>
     <w:p>
       <w:pPr>
-        <w:pStyle w:val="Aufzhlungszeichen"/>
+        <w:pStyle w:val="font-claude-response-body"/>
         <w:rPr>
           <w:lang w:val="de-DE"/>
         </w:rPr>
       </w:pPr>
       <w:r>
         <w:rPr>
-          <w:b/>
           <w:lang w:val="de-DE"/>
         </w:rPr>
-        <w:t xml:space="preserve">Welche Ergebnisse gibt es? (mit Zahlen) </w:t>
-      </w:r>
-      <w:r>
-        <w:rPr>
-          <w:i/>
-          <w:lang w:val="de-DE"/>
-        </w:rPr>
-        <w:t>[Hier eintragen]</w:t>
+        <w:t xml:space="preserve">Ich übersetze strategische Ziele in operative Realitäten – mit fundiertem Verständnis für Märkte, Partner und Prozesse. Das bedeutet: Ich helfe bei der Marktanalyse, identifiziere richtige Partnerschaften, navigiere Anforderungen und gestalte Umsetzungspläne, die im lokalen Kontext funktionieren. </w:t>
       </w:r>
     </w:p>
     <w:p>
       <w:pPr>
+        <w:pStyle w:val="font-claude-response-body"/>
         <w:rPr>
           <w:lang w:val="de-DE"/>
         </w:rPr>
       </w:pPr>
-    </w:p>
-    <w:p>
-      <w:pPr>
+      <w:r>
         <w:rPr>
           <w:lang w:val="de-DE"/>
         </w:rPr>
-      </w:pPr>
-    </w:p>
-    <w:p>
-      <w:r>
-        <w:rPr>
-          <w:b/>
-        </w:rPr>
-        <w:t>Leistung 3 – Process Improvement (ca. 250 Wörter)</w:t>
+        <w:t>Mein Mehrwert liegt in risikominimierten Schritten und schlanker, handlungsfähiger Umsetzung. Statt Zeit zu verlieren, beschleunige ich echte Markteintrittsschritte. Das Ergebnis: tragfähige Strukturen, funktionierende Teams und Anlagen, die von Anfang an produktiv sind.</w:t>
       </w:r>
     </w:p>
     <w:p>
       <w:pPr>
-        <w:pStyle w:val="Aufzhlungszeichen"/>
+        <w:pStyle w:val="berschrift3"/>
         <w:rPr>
           <w:lang w:val="de-DE"/>
         </w:rPr>
       </w:pPr>
       <w:r>
         <w:rPr>
+          <w:rStyle w:val="Fett"/>
           <w:b/>
+          <w:bCs/>
           <w:lang w:val="de-DE"/>
         </w:rPr>
-        <w:t xml:space="preserve">Was ist das? </w:t>
-      </w:r>
-      <w:r>
-        <w:rPr>
-          <w:i/>
-          <w:lang w:val="de-DE"/>
-        </w:rPr>
-        <w:t>[Hier eintragen]</w:t>
+        <w:t>Strategic Consulting</w:t>
       </w:r>
     </w:p>
     <w:p>
       <w:pPr>
-        <w:pStyle w:val="Aufzhlungszeichen"/>
+        <w:pStyle w:val="font-claude-response-body"/>
         <w:rPr>
           <w:lang w:val="de-DE"/>
         </w:rPr>
       </w:pPr>
       <w:r>
         <w:rPr>
-          <w:b/>
           <w:lang w:val="de-DE"/>
         </w:rPr>
-        <w:t xml:space="preserve">Warum ist das wichtig? </w:t>
-      </w:r>
-      <w:r>
-        <w:rPr>
-          <w:i/>
-          <w:lang w:val="de-DE"/>
-        </w:rPr>
-        <w:t>[Hier eintragen]</w:t>
+        <w:t xml:space="preserve">Von Geschäftsmodellen über Vertriebssetups bis Wertschöpfungsketten – ich berate zu zukunftssicheren Strategien. Automotive-Unternehmen stehen heute unter erheblichem Druck: Elektrifizierung, neue Konkurrenz, verändernde Lieferketten. Klassische </w:t>
+        <w:lastRenderedPageBreak/>
+        <w:t>Strategien reichen oft nicht mehr. Wer Mitte der 2020er Jahre noch Geschäftsmodelle von vor fünf Jahren fährt, hat ein Problem.</w:t>
       </w:r>
     </w:p>
     <w:p>
       <w:pPr>
-        <w:pStyle w:val="Aufzhlungszeichen"/>
+        <w:pStyle w:val="font-claude-response-body"/>
         <w:rPr>
           <w:lang w:val="de-DE"/>
         </w:rPr>
       </w:pPr>
       <w:r>
         <w:rPr>
-          <w:b/>
           <w:lang w:val="de-DE"/>
         </w:rPr>
-        <w:t xml:space="preserve">Wie funktioniert es? </w:t>
-      </w:r>
-      <w:r>
-        <w:rPr>
-          <w:i/>
-          <w:lang w:val="de-DE"/>
-        </w:rPr>
-        <w:t>[Hier eintragen]</w:t>
+        <w:t>Datengetriebene Analyse verbindet sich mit operativer Expertise, langjähriger Erfahrung und gezielter KI-Nutzung. Ich analysiere Märkte, Konkurrenz, interne Fähigkeiten und Kostensituationen faktisch – nicht theoretisch. Aus diesen Daten entwickle ich konkrete Strategieoptionen, diskutiere sie mit dem Management und priorisiere Handlungsschritte nach Realismus und Wirkung.</w:t>
       </w:r>
     </w:p>
     <w:p>
       <w:pPr>
-        <w:pStyle w:val="Aufzhlungszeichen"/>
+        <w:pStyle w:val="font-claude-response-body"/>
+      </w:pPr>
+      <w:r>
         <w:rPr>
           <w:lang w:val="de-DE"/>
         </w:rPr>
-      </w:pPr>
-      <w:r>
-        <w:rPr>
-          <w:b/>
-          <w:lang w:val="de-DE"/>
-        </w:rPr>
-        <w:lastRenderedPageBreak/>
-        <w:t xml:space="preserve">Welche Ergebnisse gibt es? (mit Zahlen) </w:t>
+        <w:t xml:space="preserve">Mein Resultat: klare Handlungsprogramme für Vorstand und Management. Das sind keine dicken Powerpointpräsentationen, sondern operative Fahrpläne, die die nächsten 12–24 Monate konkret steuern. Ich begleite auch die Umsetzung – denn eine brillante Strategie, die nicht umgesetzt wird, ist wertlos. </w:t>
       </w:r>
       <w:r>
-        <w:rPr>
-          <w:i/>
-          <w:lang w:val="de-DE"/>
-        </w:rPr>
-        <w:t>[Hier eintragen]</w:t>
+        <w:t>Mein Ansatz dabei: aus Strategie wird Realität.</w:t>
       </w:r>
-    </w:p>
-    <w:p>
-      <w:pPr>
-        <w:rPr>
-          <w:lang w:val="de-DE"/>
-        </w:rPr>
-      </w:pPr>
-    </w:p>
-    <w:p>
-      <w:pPr>
-        <w:rPr>
-          <w:lang w:val="de-DE"/>
-        </w:rPr>
-      </w:pPr>
-    </w:p>
-    <w:p>
-      <w:r>
-        <w:rPr>
-          <w:b/>
-        </w:rPr>
-        <w:t>Leistung 4 – Strategic Consulting (ca. 250 Wörter)</w:t>
-      </w:r>
-    </w:p>
-    <w:p>
-      <w:pPr>
-        <w:pStyle w:val="Aufzhlungszeichen"/>
-        <w:rPr>
-          <w:lang w:val="de-DE"/>
-        </w:rPr>
-      </w:pPr>
-      <w:r>
-        <w:rPr>
-          <w:b/>
-          <w:lang w:val="de-DE"/>
-        </w:rPr>
-        <w:t xml:space="preserve">Was ist das? </w:t>
-      </w:r>
-      <w:r>
-        <w:rPr>
-          <w:i/>
-          <w:lang w:val="de-DE"/>
-        </w:rPr>
-        <w:t>[Hier eintragen]</w:t>
-      </w:r>
-    </w:p>
-    <w:p>
-      <w:pPr>
-        <w:pStyle w:val="Aufzhlungszeichen"/>
-        <w:rPr>
-          <w:lang w:val="de-DE"/>
-        </w:rPr>
-      </w:pPr>
-      <w:r>
-        <w:rPr>
-          <w:b/>
-          <w:lang w:val="de-DE"/>
-        </w:rPr>
-        <w:t xml:space="preserve">Warum ist das wichtig? </w:t>
-      </w:r>
-      <w:r>
-        <w:rPr>
-          <w:i/>
-          <w:lang w:val="de-DE"/>
-        </w:rPr>
-        <w:t>[Hier eintragen]</w:t>
-      </w:r>
-    </w:p>
-    <w:p>
-      <w:pPr>
-        <w:pStyle w:val="Aufzhlungszeichen"/>
-        <w:rPr>
-          <w:lang w:val="de-DE"/>
-        </w:rPr>
-      </w:pPr>
-      <w:r>
-        <w:rPr>
-          <w:b/>
-          <w:lang w:val="de-DE"/>
-        </w:rPr>
-        <w:t xml:space="preserve">Wie funktioniert es? </w:t>
-      </w:r>
-      <w:r>
-        <w:rPr>
-          <w:i/>
-          <w:lang w:val="de-DE"/>
-        </w:rPr>
-        <w:t>[Hier eintragen]</w:t>
-      </w:r>
-    </w:p>
-    <w:p>
-      <w:pPr>
-        <w:pStyle w:val="Aufzhlungszeichen"/>
-        <w:rPr>
-          <w:lang w:val="de-DE"/>
-        </w:rPr>
-      </w:pPr>
-      <w:r>
-        <w:rPr>
-          <w:b/>
-          <w:lang w:val="de-DE"/>
-        </w:rPr>
-        <w:t xml:space="preserve">Welche Ergebnisse gibt es? (mit Zahlen) </w:t>
-      </w:r>
-      <w:r>
-        <w:rPr>
-          <w:i/>
-          <w:lang w:val="de-DE"/>
-        </w:rPr>
-        <w:t>[Hier eintragen]</w:t>
-      </w:r>
-    </w:p>
-    <w:p>
-      <w:pPr>
-        <w:rPr>
-          <w:lang w:val="de-DE"/>
-        </w:rPr>
-      </w:pPr>
     </w:p>
     <w:p>
       <w:pPr>
@@ -1142,10 +877,7 @@
               <w:cnfStyle w:val="000000100000" w:firstRow="0" w:lastRow="0" w:firstColumn="0" w:lastColumn="0" w:oddVBand="0" w:evenVBand="0" w:oddHBand="1" w:evenHBand="0" w:firstRowFirstColumn="0" w:firstRowLastColumn="0" w:lastRowFirstColumn="0" w:lastRowLastColumn="0"/>
             </w:pPr>
             <w:r>
-              <w:t>☐</w:t>
-            </w:r>
-            <w:r>
-              <w:t xml:space="preserve"> offen   ☐ erledigt</w:t>
+              <w:t>☐ offen   ☐ erledigt</w:t>
             </w:r>
           </w:p>
         </w:tc>
@@ -1197,10 +929,7 @@
               <w:cnfStyle w:val="000000010000" w:firstRow="0" w:lastRow="0" w:firstColumn="0" w:lastColumn="0" w:oddVBand="0" w:evenVBand="0" w:oddHBand="0" w:evenHBand="1" w:firstRowFirstColumn="0" w:firstRowLastColumn="0" w:lastRowFirstColumn="0" w:lastRowLastColumn="0"/>
             </w:pPr>
             <w:r>
-              <w:t>☐</w:t>
-            </w:r>
-            <w:r>
-              <w:t xml:space="preserve"> offen   ☐ erledigt</w:t>
+              <w:t>☐ offen   ☐ erledigt</w:t>
             </w:r>
           </w:p>
         </w:tc>
@@ -1252,10 +981,7 @@
               <w:cnfStyle w:val="000000100000" w:firstRow="0" w:lastRow="0" w:firstColumn="0" w:lastColumn="0" w:oddVBand="0" w:evenVBand="0" w:oddHBand="1" w:evenHBand="0" w:firstRowFirstColumn="0" w:firstRowLastColumn="0" w:lastRowFirstColumn="0" w:lastRowLastColumn="0"/>
             </w:pPr>
             <w:r>
-              <w:t>☐</w:t>
-            </w:r>
-            <w:r>
-              <w:t xml:space="preserve"> offen   ☐ erledigt</w:t>
+              <w:t>☐ offen   ☐ erledigt</w:t>
             </w:r>
           </w:p>
         </w:tc>
@@ -1307,10 +1033,7 @@
               <w:cnfStyle w:val="000000010000" w:firstRow="0" w:lastRow="0" w:firstColumn="0" w:lastColumn="0" w:oddVBand="0" w:evenVBand="0" w:oddHBand="0" w:evenHBand="1" w:firstRowFirstColumn="0" w:firstRowLastColumn="0" w:lastRowFirstColumn="0" w:lastRowLastColumn="0"/>
             </w:pPr>
             <w:r>
-              <w:t>☐</w:t>
-            </w:r>
-            <w:r>
-              <w:t xml:space="preserve"> offen   ☐ erledigt</w:t>
+              <w:t>☐ offen   ☐ erledigt</w:t>
             </w:r>
           </w:p>
         </w:tc>
@@ -1362,10 +1085,7 @@
               <w:cnfStyle w:val="000000100000" w:firstRow="0" w:lastRow="0" w:firstColumn="0" w:lastColumn="0" w:oddVBand="0" w:evenVBand="0" w:oddHBand="1" w:evenHBand="0" w:firstRowFirstColumn="0" w:firstRowLastColumn="0" w:lastRowFirstColumn="0" w:lastRowLastColumn="0"/>
             </w:pPr>
             <w:r>
-              <w:t>☐</w:t>
-            </w:r>
-            <w:r>
-              <w:t xml:space="preserve"> offen   ☐ erledigt</w:t>
+              <w:t>☐ offen   ☐ erledigt</w:t>
             </w:r>
           </w:p>
         </w:tc>
@@ -1417,10 +1137,7 @@
               <w:cnfStyle w:val="000000010000" w:firstRow="0" w:lastRow="0" w:firstColumn="0" w:lastColumn="0" w:oddVBand="0" w:evenVBand="0" w:oddHBand="0" w:evenHBand="1" w:firstRowFirstColumn="0" w:firstRowLastColumn="0" w:lastRowFirstColumn="0" w:lastRowLastColumn="0"/>
             </w:pPr>
             <w:r>
-              <w:t>☐</w:t>
-            </w:r>
-            <w:r>
-              <w:t xml:space="preserve"> offen   ☐ erledigt</w:t>
+              <w:t>☐ offen   ☐ erledigt</w:t>
             </w:r>
           </w:p>
         </w:tc>
@@ -13032,6 +12749,19 @@
       </w:tcPr>
     </w:tblStylePr>
   </w:style>
+  <w:style w:type="paragraph" w:customStyle="1" w:styleId="font-claude-response-body">
+    <w:name w:val="font-claude-response-body"/>
+    <w:basedOn w:val="Standard"/>
+    <w:rsid w:val="00FC1657"/>
+    <w:pPr>
+      <w:spacing w:before="100" w:beforeAutospacing="1" w:after="100" w:afterAutospacing="1" w:line="240" w:lineRule="auto"/>
+    </w:pPr>
+    <w:rPr>
+      <w:rFonts w:ascii="Times New Roman" w:eastAsia="Times New Roman" w:hAnsi="Times New Roman" w:cs="Times New Roman"/>
+      <w:sz w:val="24"/>
+      <w:szCs w:val="24"/>
+    </w:rPr>
+  </w:style>
 </w:styles>
 </file>
 

</xml_diff>

<commit_message>
Strategic Consulting / Strategische Beratung zu Strategie Beratung umbenennen
Vierte Leistung durchgaengig umbenannt: Home-Karte, Services-Seite (H3,
Meta-Description, Bild-Alt-Text, Bilddatei service-strategie-beratung.jpg)
sowie in den Planungsdokumenten (anforderungsliste.md, roadmap.md,
ToDo-Docx), um Widersprueche zwischen Doku und Website zu vermeiden.
</commit_message>
<xml_diff>
--- a/docs/Pro4Ex-Website-ToDo-Content-Bilder.docx
+++ b/docs/Pro4Ex-Website-ToDo-Content-Bilder.docx
@@ -217,7 +217,7 @@
           <w:b/>
           <w:lang w:val="de-DE"/>
         </w:rPr>
-        <w:t>Beispiel 4 – Strategic Consulting (generelle Automotive Strategien oder auch Vertriebsstrategien)</w:t>
+        <w:t>Beispiel 4 – Strategie Beratung (generelle Automotive Strategien oder auch Vertriebsstrategien)</w:t>
       </w:r>
     </w:p>
     <w:p>
@@ -557,7 +557,7 @@
           <w:bCs/>
           <w:lang w:val="de-DE"/>
         </w:rPr>
-        <w:t>Strategic Consulting</w:t>
+        <w:t>Strategie Beratung</w:t>
       </w:r>
     </w:p>
     <w:p>
@@ -1059,7 +1059,7 @@
           </w:tcPr>
           <w:p>
             <w:r>
-              <w:t>Service-Bild 4 – Strategic Consulting</w:t>
+              <w:t>Service-Bild 4 – Strategie Beratung</w:t>
             </w:r>
           </w:p>
         </w:tc>

</xml_diff>